<commit_message>
update do documento de analise de requisitos projecto 0; update da model de usuarios e criacao de mais duas models: NivelAcesso e Permissao - para que possa reflitir a estrutura do banco de dados; update do UsuarioDAO e da MainController para efeitos de login
</commit_message>
<xml_diff>
--- a/Projecto 0 - Projecto de Analise de Requisitos.docx
+++ b/Projecto 0 - Projecto de Analise de Requisitos.docx
@@ -34,8 +34,6 @@
         <w:jc w:val="right"/>
         <w:rPr>
           <w:rFonts w:ascii="Times New Roman" w:hAnsi="Times New Roman" w:cs="Times New Roman"/>
-          <w:b/>
-          <w:bCs/>
           <w:sz w:val="48"/>
           <w:szCs w:val="48"/>
         </w:rPr>
@@ -43,8 +41,6 @@
       <w:r>
         <w:rPr>
           <w:rFonts w:ascii="Times New Roman" w:hAnsi="Times New Roman" w:cs="Times New Roman"/>
-          <w:b/>
-          <w:bCs/>
           <w:sz w:val="48"/>
           <w:szCs w:val="48"/>
         </w:rPr>
@@ -53,8 +49,6 @@
       <w:r>
         <w:rPr>
           <w:rFonts w:ascii="Times New Roman" w:hAnsi="Times New Roman" w:cs="Times New Roman"/>
-          <w:b/>
-          <w:bCs/>
           <w:sz w:val="48"/>
           <w:szCs w:val="48"/>
         </w:rPr>
@@ -63,8 +57,6 @@
       <w:r>
         <w:rPr>
           <w:rFonts w:ascii="Times New Roman" w:hAnsi="Times New Roman" w:cs="Times New Roman"/>
-          <w:b/>
-          <w:bCs/>
           <w:sz w:val="48"/>
           <w:szCs w:val="48"/>
         </w:rPr>
@@ -73,8 +65,6 @@
       <w:r>
         <w:rPr>
           <w:rFonts w:ascii="Times New Roman" w:hAnsi="Times New Roman" w:cs="Times New Roman"/>
-          <w:b/>
-          <w:bCs/>
           <w:sz w:val="48"/>
           <w:szCs w:val="48"/>
         </w:rPr>
@@ -87,8 +77,6 @@
         <w:jc w:val="right"/>
         <w:rPr>
           <w:rFonts w:ascii="Times New Roman" w:hAnsi="Times New Roman" w:cs="Times New Roman"/>
-          <w:b/>
-          <w:bCs/>
           <w:sz w:val="48"/>
           <w:szCs w:val="48"/>
         </w:rPr>
@@ -100,8 +88,6 @@
         <w:jc w:val="right"/>
         <w:rPr>
           <w:rFonts w:ascii="Times New Roman" w:hAnsi="Times New Roman" w:cs="Times New Roman"/>
-          <w:b/>
-          <w:bCs/>
           <w:sz w:val="48"/>
           <w:szCs w:val="48"/>
         </w:rPr>
@@ -109,8 +95,6 @@
       <w:r>
         <w:rPr>
           <w:rFonts w:ascii="Times New Roman" w:hAnsi="Times New Roman" w:cs="Times New Roman"/>
-          <w:b/>
-          <w:bCs/>
           <w:sz w:val="48"/>
           <w:szCs w:val="48"/>
         </w:rPr>
@@ -123,8 +107,6 @@
         <w:jc w:val="right"/>
         <w:rPr>
           <w:rFonts w:ascii="Times New Roman" w:hAnsi="Times New Roman" w:cs="Times New Roman"/>
-          <w:b/>
-          <w:bCs/>
           <w:sz w:val="48"/>
           <w:szCs w:val="48"/>
         </w:rPr>
@@ -132,12 +114,20 @@
       <w:r>
         <w:rPr>
           <w:rFonts w:ascii="Times New Roman" w:hAnsi="Times New Roman" w:cs="Times New Roman"/>
-          <w:b/>
-          <w:bCs/>
           <w:sz w:val="48"/>
           <w:szCs w:val="48"/>
         </w:rPr>
-        <w:t>Para JM-InvSM</w:t>
+        <w:t xml:space="preserve">Para </w:t>
+      </w:r>
+      <w:r>
+        <w:rPr>
+          <w:rFonts w:ascii="Times New Roman" w:hAnsi="Times New Roman" w:cs="Times New Roman"/>
+          <w:b/>
+          <w:bCs/>
+          <w:sz w:val="48"/>
+          <w:szCs w:val="48"/>
+        </w:rPr>
+        <w:t>JM-InvSM</w:t>
       </w:r>
     </w:p>
     <w:p>
@@ -146,8 +136,6 @@
         <w:jc w:val="right"/>
         <w:rPr>
           <w:rFonts w:ascii="Times New Roman" w:hAnsi="Times New Roman" w:cs="Times New Roman"/>
-          <w:b/>
-          <w:bCs/>
           <w:sz w:val="48"/>
           <w:szCs w:val="48"/>
         </w:rPr>
@@ -155,8 +143,6 @@
       <w:r>
         <w:rPr>
           <w:rFonts w:ascii="Times New Roman" w:hAnsi="Times New Roman" w:cs="Times New Roman"/>
-          <w:b/>
-          <w:bCs/>
           <w:sz w:val="48"/>
           <w:szCs w:val="48"/>
         </w:rPr>
@@ -426,6 +412,107 @@
           </w:p>
         </w:tc>
       </w:tr>
+      <w:tr>
+        <w:tc>
+          <w:tcPr>
+            <w:tcW w:w="1165" w:type="dxa"/>
+            <w:vAlign w:val="center"/>
+          </w:tcPr>
+          <w:p>
+            <w:pPr>
+              <w:spacing w:line="360" w:lineRule="auto"/>
+              <w:jc w:val="center"/>
+              <w:rPr>
+                <w:rFonts w:ascii="Times New Roman" w:hAnsi="Times New Roman" w:cs="Times New Roman"/>
+                <w:sz w:val="20"/>
+                <w:szCs w:val="20"/>
+              </w:rPr>
+            </w:pPr>
+            <w:r>
+              <w:rPr>
+                <w:rFonts w:ascii="Times New Roman" w:hAnsi="Times New Roman" w:cs="Times New Roman"/>
+                <w:sz w:val="20"/>
+                <w:szCs w:val="20"/>
+              </w:rPr>
+              <w:t>2024-09-30</w:t>
+            </w:r>
+          </w:p>
+        </w:tc>
+        <w:tc>
+          <w:tcPr>
+            <w:tcW w:w="810" w:type="dxa"/>
+            <w:vAlign w:val="center"/>
+          </w:tcPr>
+          <w:p>
+            <w:pPr>
+              <w:spacing w:line="360" w:lineRule="auto"/>
+              <w:jc w:val="center"/>
+              <w:rPr>
+                <w:rFonts w:ascii="Times New Roman" w:hAnsi="Times New Roman" w:cs="Times New Roman"/>
+                <w:sz w:val="20"/>
+                <w:szCs w:val="20"/>
+              </w:rPr>
+            </w:pPr>
+            <w:r>
+              <w:rPr>
+                <w:rFonts w:ascii="Times New Roman" w:hAnsi="Times New Roman" w:cs="Times New Roman"/>
+                <w:sz w:val="20"/>
+                <w:szCs w:val="20"/>
+              </w:rPr>
+              <w:t>1.1</w:t>
+            </w:r>
+          </w:p>
+        </w:tc>
+        <w:tc>
+          <w:tcPr>
+            <w:tcW w:w="5130" w:type="dxa"/>
+          </w:tcPr>
+          <w:p>
+            <w:pPr>
+              <w:spacing w:line="360" w:lineRule="auto"/>
+              <w:jc w:val="both"/>
+              <w:rPr>
+                <w:rFonts w:ascii="Times New Roman" w:hAnsi="Times New Roman" w:cs="Times New Roman"/>
+                <w:sz w:val="20"/>
+                <w:szCs w:val="20"/>
+              </w:rPr>
+            </w:pPr>
+            <w:r>
+              <w:rPr>
+                <w:rFonts w:ascii="Times New Roman" w:hAnsi="Times New Roman" w:cs="Times New Roman"/>
+                <w:sz w:val="20"/>
+                <w:szCs w:val="20"/>
+              </w:rPr>
+              <w:t>Revisão</w:t>
+            </w:r>
+          </w:p>
+        </w:tc>
+        <w:tc>
+          <w:tcPr>
+            <w:tcW w:w="1389" w:type="dxa"/>
+            <w:vAlign w:val="center"/>
+          </w:tcPr>
+          <w:p>
+            <w:pPr>
+              <w:spacing w:line="360" w:lineRule="auto"/>
+              <w:jc w:val="center"/>
+              <w:rPr>
+                <w:rFonts w:ascii="Times New Roman" w:hAnsi="Times New Roman" w:cs="Times New Roman"/>
+                <w:sz w:val="20"/>
+                <w:szCs w:val="20"/>
+              </w:rPr>
+            </w:pPr>
+            <w:r>
+              <w:rPr>
+                <w:rFonts w:ascii="Times New Roman" w:hAnsi="Times New Roman" w:cs="Times New Roman"/>
+                <w:sz w:val="20"/>
+                <w:szCs w:val="20"/>
+              </w:rPr>
+              <w:t>Amilcar Mula</w:t>
+            </w:r>
+          </w:p>
+        </w:tc>
+      </w:tr>
     </w:tbl>
     <w:p>
       <w:pPr>
@@ -474,36 +561,11 @@
     </w:p>
     <w:p>
       <w:pPr>
-        <w:spacing w:line="360" w:lineRule="auto"/>
-        <w:jc w:val="center"/>
-        <w:rPr>
-          <w:rFonts w:ascii="Times New Roman" w:hAnsi="Times New Roman" w:cs="Times New Roman"/>
-          <w:b/>
-          <w:bCs/>
-          <w:sz w:val="24"/>
-          <w:szCs w:val="24"/>
-        </w:rPr>
-      </w:pPr>
-      <w:r>
-        <w:rPr>
-          <w:rFonts w:ascii="Times New Roman" w:hAnsi="Times New Roman" w:cs="Times New Roman"/>
-          <w:b/>
-          <w:bCs/>
-          <w:sz w:val="24"/>
-          <w:szCs w:val="24"/>
-        </w:rPr>
+        <w:pStyle w:val="Heading1"/>
+      </w:pPr>
+      <w:r>
         <w:lastRenderedPageBreak/>
-        <w:t>Projeto de</w:t>
-      </w:r>
-      <w:r>
-        <w:rPr>
-          <w:rFonts w:ascii="Times New Roman" w:hAnsi="Times New Roman" w:cs="Times New Roman"/>
-          <w:b/>
-          <w:bCs/>
-          <w:sz w:val="24"/>
-          <w:szCs w:val="24"/>
-        </w:rPr>
-        <w:t xml:space="preserve"> Analise de requisitos do sistema</w:t>
+        <w:t>Introdução</w:t>
       </w:r>
     </w:p>
     <w:p>
@@ -512,21 +574,67 @@
         <w:jc w:val="both"/>
         <w:rPr>
           <w:rFonts w:ascii="Times New Roman" w:hAnsi="Times New Roman" w:cs="Times New Roman"/>
-          <w:b/>
-          <w:bCs/>
-          <w:sz w:val="24"/>
-          <w:szCs w:val="24"/>
-        </w:rPr>
-      </w:pPr>
-      <w:r>
-        <w:rPr>
-          <w:rFonts w:ascii="Times New Roman" w:hAnsi="Times New Roman" w:cs="Times New Roman"/>
-          <w:b/>
-          <w:bCs/>
-          <w:sz w:val="24"/>
-          <w:szCs w:val="24"/>
-        </w:rPr>
-        <w:t>Introdução</w:t>
+          <w:sz w:val="24"/>
+          <w:szCs w:val="24"/>
+        </w:rPr>
+      </w:pPr>
+      <w:r>
+        <w:rPr>
+          <w:rFonts w:ascii="Times New Roman" w:hAnsi="Times New Roman" w:cs="Times New Roman"/>
+          <w:sz w:val="24"/>
+          <w:szCs w:val="24"/>
+        </w:rPr>
+        <w:t>Este documento descreve os requisitos d</w:t>
+      </w:r>
+      <w:r>
+        <w:rPr>
+          <w:rFonts w:ascii="Times New Roman" w:hAnsi="Times New Roman" w:cs="Times New Roman"/>
+          <w:sz w:val="24"/>
+          <w:szCs w:val="24"/>
+        </w:rPr>
+        <w:t>e desenvolvimento d</w:t>
+      </w:r>
+      <w:r>
+        <w:rPr>
+          <w:rFonts w:ascii="Times New Roman" w:hAnsi="Times New Roman" w:cs="Times New Roman"/>
+          <w:sz w:val="24"/>
+          <w:szCs w:val="24"/>
+        </w:rPr>
+        <w:t xml:space="preserve">o sistema </w:t>
+      </w:r>
+      <w:r>
+        <w:rPr>
+          <w:rFonts w:ascii="Times New Roman" w:hAnsi="Times New Roman" w:cs="Times New Roman"/>
+          <w:b/>
+          <w:bCs/>
+          <w:sz w:val="24"/>
+          <w:szCs w:val="24"/>
+        </w:rPr>
+        <w:t>JM-InvSM</w:t>
+      </w:r>
+      <w:r>
+        <w:rPr>
+          <w:rFonts w:ascii="Times New Roman" w:hAnsi="Times New Roman" w:cs="Times New Roman"/>
+          <w:sz w:val="24"/>
+          <w:szCs w:val="24"/>
+        </w:rPr>
+        <w:t xml:space="preserve"> (JM-Invoice Stock Master)</w:t>
+      </w:r>
+      <w:r>
+        <w:rPr>
+          <w:rFonts w:ascii="Times New Roman" w:hAnsi="Times New Roman" w:cs="Times New Roman"/>
+          <w:sz w:val="24"/>
+          <w:szCs w:val="24"/>
+        </w:rPr>
+        <w:t xml:space="preserve"> o </w:t>
+      </w:r>
+      <w:r>
+        <w:rPr>
+          <w:rFonts w:ascii="Times New Roman" w:hAnsi="Times New Roman" w:cs="Times New Roman"/>
+          <w:sz w:val="24"/>
+          <w:szCs w:val="24"/>
+        </w:rPr>
+        <w:t>compõem. O objetivo principal é fornecer uma visão clara e compreensível das funcionalidades esperadas do sistema, assegurando que todos os envolvidos no projeto tenham um entendimento comum das expectativas e requisitos.</w:t>
       </w:r>
     </w:p>
     <w:p>
@@ -545,25 +653,71 @@
           <w:sz w:val="24"/>
           <w:szCs w:val="24"/>
         </w:rPr>
-        <w:t xml:space="preserve">Este documento descreve os requisitos do sistema </w:t>
-      </w:r>
-      <w:r>
-        <w:rPr>
-          <w:rFonts w:ascii="Times New Roman" w:hAnsi="Times New Roman" w:cs="Times New Roman"/>
-          <w:b/>
-          <w:bCs/>
-          <w:sz w:val="24"/>
-          <w:szCs w:val="24"/>
-        </w:rPr>
-        <w:t>JM-InvSM</w:t>
-      </w:r>
-      <w:r>
-        <w:rPr>
-          <w:rFonts w:ascii="Times New Roman" w:hAnsi="Times New Roman" w:cs="Times New Roman"/>
-          <w:sz w:val="24"/>
-          <w:szCs w:val="24"/>
-        </w:rPr>
-        <w:t xml:space="preserve"> (JM-Invoice Stock Master), incluindo os diversos módulos que compõem a aplicação. O objetivo principal deste documento é fornecer uma visão clara e compreensível das funcionalidades esperadas do sistema, assegurando que todos os envolvidos no projeto tenham um entendimento comum das expectativas e requisitos.</w:t>
+        <w:t xml:space="preserve">Este SRS abrange todos os módulos do sistema, </w:t>
+      </w:r>
+      <w:r>
+        <w:rPr>
+          <w:rFonts w:ascii="Times New Roman" w:hAnsi="Times New Roman" w:cs="Times New Roman"/>
+          <w:sz w:val="24"/>
+          <w:szCs w:val="24"/>
+        </w:rPr>
+        <w:t>tais como:</w:t>
+      </w:r>
+      <w:r>
+        <w:rPr>
+          <w:rFonts w:ascii="Times New Roman" w:hAnsi="Times New Roman" w:cs="Times New Roman"/>
+          <w:sz w:val="24"/>
+          <w:szCs w:val="24"/>
+        </w:rPr>
+        <w:t xml:space="preserve"> gestão de usuários, clientes, fornecedores, produtos e serviços, bem como a emissão de faturas e relatórios</w:t>
+      </w:r>
+      <w:r>
+        <w:rPr>
+          <w:rFonts w:ascii="Times New Roman" w:hAnsi="Times New Roman" w:cs="Times New Roman"/>
+          <w:sz w:val="24"/>
+          <w:szCs w:val="24"/>
+        </w:rPr>
+        <w:t>, e outros tipos de documentos de interesse comercial</w:t>
+      </w:r>
+      <w:r>
+        <w:rPr>
+          <w:rFonts w:ascii="Times New Roman" w:hAnsi="Times New Roman" w:cs="Times New Roman"/>
+          <w:sz w:val="24"/>
+          <w:szCs w:val="24"/>
+        </w:rPr>
+        <w:t>. Ao especificar os requisitos de forma detalhada, buscamos facilitar a comunicação entre as partes interessadas</w:t>
+      </w:r>
+      <w:r>
+        <w:rPr>
+          <w:rFonts w:ascii="Times New Roman" w:hAnsi="Times New Roman" w:cs="Times New Roman"/>
+          <w:sz w:val="24"/>
+          <w:szCs w:val="24"/>
+        </w:rPr>
+        <w:t xml:space="preserve"> (</w:t>
+      </w:r>
+      <w:r>
+        <w:rPr>
+          <w:rFonts w:ascii="Times New Roman" w:hAnsi="Times New Roman" w:cs="Times New Roman"/>
+          <w:sz w:val="24"/>
+          <w:szCs w:val="24"/>
+        </w:rPr>
+        <w:t>desenvolvedores e usuários finais</w:t>
+      </w:r>
+      <w:r>
+        <w:rPr>
+          <w:rFonts w:ascii="Times New Roman" w:hAnsi="Times New Roman" w:cs="Times New Roman"/>
+          <w:sz w:val="24"/>
+          <w:szCs w:val="24"/>
+        </w:rPr>
+        <w:t>)</w:t>
+      </w:r>
+      <w:r>
+        <w:rPr>
+          <w:rFonts w:ascii="Times New Roman" w:hAnsi="Times New Roman" w:cs="Times New Roman"/>
+          <w:sz w:val="24"/>
+          <w:szCs w:val="24"/>
+        </w:rPr>
+        <w:t>, promovendo um alinhamento eficaz no desenvolvimento e na implementação do sistema.</w:t>
       </w:r>
     </w:p>
     <w:p>
@@ -582,7 +736,42 @@
           <w:sz w:val="24"/>
           <w:szCs w:val="24"/>
         </w:rPr>
-        <w:t>Este SRS abrange todos os módulos do sistema, incluindo a gestão de usuários, clientes, fornecedores, produtos e serviços, bem como a emissão de faturas e relatórios. Ao especificar os requisitos de forma detalhada, buscamos facilitar a comunicação entre as partes interessadas, desenvolvedores e usuários finais, promovendo um alinhamento eficaz no desenvolvimento e na implementação do sistema.</w:t>
+        <w:t xml:space="preserve">Este documento não apenas servirá como uma referência para o desenvolvimento do software, mas também como uma base para futuras atualizações e melhorias, garantindo que o </w:t>
+      </w:r>
+      <w:r>
+        <w:rPr>
+          <w:rFonts w:ascii="Times New Roman" w:hAnsi="Times New Roman" w:cs="Times New Roman"/>
+          <w:b/>
+          <w:bCs/>
+          <w:sz w:val="24"/>
+          <w:szCs w:val="24"/>
+        </w:rPr>
+        <w:t>JM-InvSM</w:t>
+      </w:r>
+      <w:r>
+        <w:rPr>
+          <w:rFonts w:ascii="Times New Roman" w:hAnsi="Times New Roman" w:cs="Times New Roman"/>
+          <w:sz w:val="24"/>
+          <w:szCs w:val="24"/>
+        </w:rPr>
+        <w:t xml:space="preserve"> atenda às necessidades dinâmicas do mercado e dos usuários.</w:t>
+      </w:r>
+      <w:r>
+        <w:rPr>
+          <w:rFonts w:ascii="Times New Roman" w:hAnsi="Times New Roman" w:cs="Times New Roman"/>
+          <w:sz w:val="24"/>
+          <w:szCs w:val="24"/>
+        </w:rPr>
+        <w:br w:type="page"/>
+      </w:r>
+    </w:p>
+    <w:p>
+      <w:pPr>
+        <w:pStyle w:val="Heading1"/>
+      </w:pPr>
+      <w:r>
+        <w:lastRenderedPageBreak/>
+        <w:t>Escopo do sistemas</w:t>
       </w:r>
     </w:p>
     <w:p>
@@ -593,23 +782,26 @@
           <w:rFonts w:ascii="Times New Roman" w:hAnsi="Times New Roman" w:cs="Times New Roman"/>
           <w:sz w:val="24"/>
           <w:szCs w:val="24"/>
-        </w:rPr>
-      </w:pPr>
-      <w:r>
-        <w:rPr>
-          <w:rFonts w:ascii="Times New Roman" w:hAnsi="Times New Roman" w:cs="Times New Roman"/>
-          <w:sz w:val="24"/>
-          <w:szCs w:val="24"/>
-        </w:rPr>
-        <w:t xml:space="preserve">Este documento não apenas servirá como uma referência para o desenvolvimento do software, mas também como uma base para futuras atualizações e melhorias, garantindo que o </w:t>
-      </w:r>
-      <w:r>
-        <w:rPr>
-          <w:rFonts w:ascii="Times New Roman" w:hAnsi="Times New Roman" w:cs="Times New Roman"/>
-          <w:b/>
-          <w:bCs/>
-          <w:sz w:val="24"/>
-          <w:szCs w:val="24"/>
+          <w:lang w:val="pt-BR"/>
+        </w:rPr>
+      </w:pPr>
+      <w:r>
+        <w:rPr>
+          <w:rFonts w:ascii="Times New Roman" w:hAnsi="Times New Roman" w:cs="Times New Roman"/>
+          <w:sz w:val="24"/>
+          <w:szCs w:val="24"/>
+          <w:lang w:val="pt-BR"/>
+        </w:rPr>
+        <w:t xml:space="preserve">O sistema </w:t>
+      </w:r>
+      <w:r>
+        <w:rPr>
+          <w:rFonts w:ascii="Times New Roman" w:hAnsi="Times New Roman" w:cs="Times New Roman"/>
+          <w:b/>
+          <w:bCs/>
+          <w:sz w:val="24"/>
+          <w:szCs w:val="24"/>
+          <w:lang w:val="pt-BR"/>
         </w:rPr>
         <w:t>JM-InvSM</w:t>
       </w:r>
@@ -618,63 +810,10 @@
           <w:rFonts w:ascii="Times New Roman" w:hAnsi="Times New Roman" w:cs="Times New Roman"/>
           <w:sz w:val="24"/>
           <w:szCs w:val="24"/>
-        </w:rPr>
-        <w:t xml:space="preserve"> atenda às necessidades dinâmicas do mercado e dos usuários.</w:t>
-      </w:r>
-    </w:p>
-    <w:p>
-      <w:pPr>
-        <w:spacing w:line="360" w:lineRule="auto"/>
-        <w:rPr>
-          <w:rFonts w:ascii="Times New Roman" w:hAnsi="Times New Roman" w:cs="Times New Roman"/>
-          <w:sz w:val="24"/>
-          <w:szCs w:val="24"/>
-        </w:rPr>
-      </w:pPr>
-      <w:r>
-        <w:rPr>
-          <w:rFonts w:ascii="Times New Roman" w:hAnsi="Times New Roman" w:cs="Times New Roman"/>
-          <w:sz w:val="24"/>
-          <w:szCs w:val="24"/>
-        </w:rPr>
-        <w:br w:type="page"/>
-      </w:r>
-    </w:p>
-    <w:p>
-      <w:pPr>
-        <w:spacing w:line="360" w:lineRule="auto"/>
-        <w:jc w:val="both"/>
-        <w:rPr>
-          <w:rFonts w:ascii="Times New Roman" w:hAnsi="Times New Roman" w:cs="Times New Roman"/>
-          <w:b/>
-          <w:bCs/>
-          <w:sz w:val="24"/>
-          <w:szCs w:val="24"/>
-        </w:rPr>
-      </w:pPr>
-      <w:r>
-        <w:rPr>
-          <w:rFonts w:ascii="Times New Roman" w:hAnsi="Times New Roman" w:cs="Times New Roman"/>
-          <w:b/>
-          <w:bCs/>
-          <w:sz w:val="24"/>
-          <w:szCs w:val="24"/>
-        </w:rPr>
-        <w:lastRenderedPageBreak/>
-        <w:t>Escopo do sistemas</w:t>
-      </w:r>
-    </w:p>
-    <w:p>
-      <w:pPr>
-        <w:spacing w:line="360" w:lineRule="auto"/>
-        <w:jc w:val="both"/>
-        <w:rPr>
-          <w:rFonts w:ascii="Times New Roman" w:hAnsi="Times New Roman" w:cs="Times New Roman"/>
-          <w:sz w:val="24"/>
-          <w:szCs w:val="24"/>
           <w:lang w:val="pt-BR"/>
         </w:rPr>
-      </w:pPr>
+        <w:t xml:space="preserve"> (JM-Invoice Stock Master) é uma aplicação de software projetada para otimizar e facilitar a gestão de processos de controle de estoque e faturamento em ambientes empresariais. O principal propósito do sistema é permitir </w:t>
+      </w:r>
       <w:r>
         <w:rPr>
           <w:rFonts w:ascii="Times New Roman" w:hAnsi="Times New Roman" w:cs="Times New Roman"/>
@@ -682,18 +821,16 @@
           <w:szCs w:val="24"/>
           <w:lang w:val="pt-BR"/>
         </w:rPr>
-        <w:t xml:space="preserve">O sistema </w:t>
-      </w:r>
-      <w:r>
-        <w:rPr>
-          <w:rFonts w:ascii="Times New Roman" w:hAnsi="Times New Roman" w:cs="Times New Roman"/>
-          <w:b/>
-          <w:bCs/>
+        <w:t>que</w:t>
+      </w:r>
+      <w:r>
+        <w:rPr>
+          <w:rFonts w:ascii="Times New Roman" w:hAnsi="Times New Roman" w:cs="Times New Roman"/>
           <w:sz w:val="24"/>
           <w:szCs w:val="24"/>
           <w:lang w:val="pt-BR"/>
         </w:rPr>
-        <w:t>JM-InvSM</w:t>
+        <w:t xml:space="preserve"> usuários</w:t>
       </w:r>
       <w:r>
         <w:rPr>
@@ -702,7 +839,7 @@
           <w:szCs w:val="24"/>
           <w:lang w:val="pt-BR"/>
         </w:rPr>
-        <w:t xml:space="preserve"> (JM-Invoice Stock Master) é uma aplicação de software projetada para otimizar e facilitar a gestão de processos de controle de estoque e faturamento em ambientes empresariais. O principal propósito do sistema é permitir </w:t>
+        <w:t xml:space="preserve"> realizem suas funcoes em conjunto alinhamento com os propositos organizacionais dentro dos </w:t>
       </w:r>
       <w:r>
         <w:rPr>
@@ -711,56 +848,18 @@
           <w:szCs w:val="24"/>
           <w:lang w:val="pt-BR"/>
         </w:rPr>
-        <w:t>que</w:t>
-      </w:r>
-      <w:r>
-        <w:rPr>
-          <w:rFonts w:ascii="Times New Roman" w:hAnsi="Times New Roman" w:cs="Times New Roman"/>
-          <w:sz w:val="24"/>
-          <w:szCs w:val="24"/>
-          <w:lang w:val="pt-BR"/>
-        </w:rPr>
-        <w:t xml:space="preserve"> usuários</w:t>
-      </w:r>
-      <w:r>
-        <w:rPr>
-          <w:rFonts w:ascii="Times New Roman" w:hAnsi="Times New Roman" w:cs="Times New Roman"/>
-          <w:sz w:val="24"/>
-          <w:szCs w:val="24"/>
-          <w:lang w:val="pt-BR"/>
-        </w:rPr>
-        <w:t xml:space="preserve"> realizem suas funcoes em conjunto alinhamento com os propositos organizacionais dentro dos </w:t>
-      </w:r>
-      <w:r>
-        <w:rPr>
-          <w:rFonts w:ascii="Times New Roman" w:hAnsi="Times New Roman" w:cs="Times New Roman"/>
-          <w:sz w:val="24"/>
-          <w:szCs w:val="24"/>
-          <w:lang w:val="pt-BR"/>
-        </w:rPr>
         <w:t>níveis de acesso relevantes para cada tipo de organização que utilizará a aplicação.</w:t>
       </w:r>
     </w:p>
     <w:p>
       <w:pPr>
-        <w:spacing w:line="360" w:lineRule="auto"/>
-        <w:jc w:val="both"/>
-        <w:rPr>
-          <w:rFonts w:ascii="Times New Roman" w:hAnsi="Times New Roman" w:cs="Times New Roman"/>
-          <w:b/>
-          <w:bCs/>
-          <w:sz w:val="24"/>
-          <w:szCs w:val="24"/>
+        <w:pStyle w:val="Heading2"/>
+        <w:rPr>
           <w:lang w:val="en-US"/>
         </w:rPr>
       </w:pPr>
       <w:r>
         <w:rPr>
-          <w:rFonts w:ascii="Times New Roman" w:hAnsi="Times New Roman" w:cs="Times New Roman"/>
-          <w:b/>
-          <w:bCs/>
-          <w:sz w:val="24"/>
-          <w:szCs w:val="24"/>
           <w:lang w:val="en-US"/>
         </w:rPr>
         <w:t>Benefícios</w:t>
@@ -842,25 +941,40 @@
     </w:p>
     <w:p>
       <w:pPr>
-        <w:spacing w:line="360" w:lineRule="auto"/>
-        <w:jc w:val="both"/>
-        <w:rPr>
-          <w:rFonts w:ascii="Times New Roman" w:hAnsi="Times New Roman" w:cs="Times New Roman"/>
-          <w:sz w:val="24"/>
-          <w:szCs w:val="24"/>
+        <w:pStyle w:val="Heading2"/>
+        <w:rPr>
           <w:lang w:val="pt-BR"/>
         </w:rPr>
       </w:pPr>
       <w:r>
         <w:rPr>
-          <w:rFonts w:ascii="Times New Roman" w:hAnsi="Times New Roman" w:cs="Times New Roman"/>
-          <w:b/>
-          <w:bCs/>
-          <w:sz w:val="24"/>
-          <w:szCs w:val="24"/>
           <w:lang w:val="en-US"/>
         </w:rPr>
-        <w:t>Objetivos e Metas</w:t>
+        <w:t>Obje</w:t>
+      </w:r>
+      <w:r>
+        <w:rPr>
+          <w:lang w:val="en-US"/>
+        </w:rPr>
+        <w:t>c</w:t>
+      </w:r>
+      <w:r>
+        <w:rPr>
+          <w:lang w:val="en-US"/>
+        </w:rPr>
+        <w:t>tivo</w:t>
+      </w:r>
+      <w:r>
+        <w:rPr>
+          <w:lang w:val="en-US"/>
+        </w:rPr>
+        <w:t>s</w:t>
+      </w:r>
+      <w:r>
+        <w:rPr>
+          <w:lang w:val="en-US"/>
+        </w:rPr>
+        <w:t xml:space="preserve"> e Metas</w:t>
       </w:r>
     </w:p>
     <w:p>
@@ -939,6 +1053,20 @@
     </w:p>
     <w:p>
       <w:pPr>
+        <w:pStyle w:val="Heading2"/>
+        <w:rPr>
+          <w:lang w:val="pt-BR"/>
+        </w:rPr>
+      </w:pPr>
+      <w:r>
+        <w:rPr>
+          <w:lang w:val="pt-BR"/>
+        </w:rPr>
+        <w:t>Relação com Metas Corporativas</w:t>
+      </w:r>
+    </w:p>
+    <w:p>
+      <w:pPr>
         <w:spacing w:line="360" w:lineRule="auto"/>
         <w:jc w:val="both"/>
         <w:rPr>
@@ -951,19 +1079,16 @@
       <w:r>
         <w:rPr>
           <w:rFonts w:ascii="Times New Roman" w:hAnsi="Times New Roman" w:cs="Times New Roman"/>
-          <w:b/>
-          <w:bCs/>
           <w:sz w:val="24"/>
           <w:szCs w:val="24"/>
           <w:lang w:val="pt-BR"/>
         </w:rPr>
-        <w:t>Relação com Metas Corporativas</w:t>
+        <w:t>O JM-InvSM está alinhado com as metas corporativas de melhoria da produtividade e otimização dos processos internos, fornecendo uma solução que não apenas atende às necessidades atuais das empresas, mas também se adapta a suas futuras exigências. A implementação desse sistema contribuirá para a criação de um ambiente de trabalho mais organizado e eficiente, reforçando a estratégia de negócios da empresa em direção à inovação e excelência operacional.</w:t>
       </w:r>
     </w:p>
     <w:p>
       <w:pPr>
         <w:spacing w:line="360" w:lineRule="auto"/>
-        <w:jc w:val="both"/>
         <w:rPr>
           <w:rFonts w:ascii="Times New Roman" w:hAnsi="Times New Roman" w:cs="Times New Roman"/>
           <w:sz w:val="24"/>
@@ -978,49 +1103,14 @@
           <w:szCs w:val="24"/>
           <w:lang w:val="pt-BR"/>
         </w:rPr>
-        <w:t>O JM-InvSM está alinhado com as metas corporativas de melhoria da produtividade e otimização dos processos internos, fornecendo uma solução que não apenas atende às necessidades atuais das empresas, mas também se adapta a suas futuras exigências. A implementação desse sistema contribuirá para a criação de um ambiente de trabalho mais organizado e eficiente, reforçando a estratégia de negócios da empresa em direção à inovação e excelência operacional.</w:t>
-      </w:r>
-    </w:p>
-    <w:p>
-      <w:pPr>
-        <w:spacing w:line="360" w:lineRule="auto"/>
-        <w:rPr>
-          <w:rFonts w:ascii="Times New Roman" w:hAnsi="Times New Roman" w:cs="Times New Roman"/>
-          <w:sz w:val="24"/>
-          <w:szCs w:val="24"/>
-          <w:lang w:val="pt-BR"/>
-        </w:rPr>
-      </w:pPr>
-      <w:r>
-        <w:rPr>
-          <w:rFonts w:ascii="Times New Roman" w:hAnsi="Times New Roman" w:cs="Times New Roman"/>
-          <w:sz w:val="24"/>
-          <w:szCs w:val="24"/>
-          <w:lang w:val="pt-BR"/>
-        </w:rPr>
         <w:br w:type="page"/>
       </w:r>
     </w:p>
     <w:p>
       <w:pPr>
-        <w:spacing w:line="360" w:lineRule="auto"/>
-        <w:jc w:val="both"/>
-        <w:rPr>
-          <w:rFonts w:ascii="Times New Roman" w:hAnsi="Times New Roman" w:cs="Times New Roman"/>
-          <w:b/>
-          <w:bCs/>
-          <w:sz w:val="24"/>
-          <w:szCs w:val="24"/>
-        </w:rPr>
-      </w:pPr>
-      <w:r>
-        <w:rPr>
-          <w:rFonts w:ascii="Times New Roman" w:hAnsi="Times New Roman" w:cs="Times New Roman"/>
-          <w:b/>
-          <w:bCs/>
-          <w:sz w:val="24"/>
-          <w:szCs w:val="24"/>
-        </w:rPr>
+        <w:pStyle w:val="Heading2"/>
+      </w:pPr>
+      <w:r>
         <w:lastRenderedPageBreak/>
         <w:t>Definições, acrónimos e abreviações</w:t>
       </w:r>
@@ -1202,43 +1292,7 @@
           <w:szCs w:val="24"/>
           <w:lang w:val="pt-BR"/>
         </w:rPr>
-        <w:t>:</w:t>
-      </w:r>
-      <w:r>
-        <w:rPr>
-          <w:rFonts w:ascii="Times New Roman" w:hAnsi="Times New Roman" w:cs="Times New Roman"/>
-          <w:sz w:val="24"/>
-          <w:szCs w:val="24"/>
-          <w:lang w:val="pt-BR"/>
-        </w:rPr>
-        <w:t xml:space="preserve"> </w:t>
-      </w:r>
-      <w:r>
-        <w:rPr>
-          <w:rFonts w:ascii="Times New Roman" w:hAnsi="Times New Roman" w:cs="Times New Roman"/>
-          <w:sz w:val="24"/>
-          <w:szCs w:val="24"/>
-          <w:lang w:val="pt-BR"/>
-        </w:rPr>
-        <w:t xml:space="preserve">abreviacao para </w:t>
-      </w:r>
-      <w:r>
-        <w:rPr>
-          <w:rFonts w:ascii="Times New Roman" w:hAnsi="Times New Roman" w:cs="Times New Roman"/>
-          <w:sz w:val="24"/>
-          <w:szCs w:val="24"/>
-          <w:lang w:val="pt-BR"/>
-        </w:rPr>
-        <w:t>Data Access Object</w:t>
-      </w:r>
-      <w:r>
-        <w:rPr>
-          <w:rFonts w:ascii="Times New Roman" w:hAnsi="Times New Roman" w:cs="Times New Roman"/>
-          <w:sz w:val="24"/>
-          <w:szCs w:val="24"/>
-          <w:lang w:val="pt-BR"/>
-        </w:rPr>
-        <w:t xml:space="preserve"> (</w:t>
+        <w:t>: abreviacao para Data Access Object (</w:t>
       </w:r>
       <w:r>
         <w:rPr>
@@ -1319,6 +1373,15 @@
           <w:szCs w:val="24"/>
           <w:lang w:val="pt-BR"/>
         </w:rPr>
+        <w:t xml:space="preserve"> Model</w:t>
+      </w:r>
+      <w:r>
+        <w:rPr>
+          <w:rFonts w:ascii="Times New Roman" w:hAnsi="Times New Roman" w:cs="Times New Roman"/>
+          <w:sz w:val="24"/>
+          <w:szCs w:val="24"/>
+          <w:lang w:val="pt-BR"/>
+        </w:rPr>
         <w:t xml:space="preserve"> </w:t>
       </w:r>
       <w:r>
@@ -1328,7 +1391,7 @@
           <w:szCs w:val="24"/>
           <w:lang w:val="pt-BR"/>
         </w:rPr>
-        <w:t>Model</w:t>
+        <w:t>View</w:t>
       </w:r>
       <w:r>
         <w:rPr>
@@ -1346,34 +1409,7 @@
           <w:szCs w:val="24"/>
           <w:lang w:val="pt-BR"/>
         </w:rPr>
-        <w:t>View</w:t>
-      </w:r>
-      <w:r>
-        <w:rPr>
-          <w:rFonts w:ascii="Times New Roman" w:hAnsi="Times New Roman" w:cs="Times New Roman"/>
-          <w:sz w:val="24"/>
-          <w:szCs w:val="24"/>
-          <w:lang w:val="pt-BR"/>
-        </w:rPr>
-        <w:t xml:space="preserve"> </w:t>
-      </w:r>
-      <w:r>
-        <w:rPr>
-          <w:rFonts w:ascii="Times New Roman" w:hAnsi="Times New Roman" w:cs="Times New Roman"/>
-          <w:sz w:val="24"/>
-          <w:szCs w:val="24"/>
-          <w:lang w:val="pt-BR"/>
-        </w:rPr>
-        <w:t>Controller</w:t>
-      </w:r>
-      <w:r>
-        <w:rPr>
-          <w:rFonts w:ascii="Times New Roman" w:hAnsi="Times New Roman" w:cs="Times New Roman"/>
-          <w:sz w:val="24"/>
-          <w:szCs w:val="24"/>
-          <w:lang w:val="pt-BR"/>
-        </w:rPr>
-        <w:t xml:space="preserve"> (</w:t>
+        <w:t>Controller (</w:t>
       </w:r>
       <w:r>
         <w:rPr>
@@ -1409,11 +1445,50 @@
         <w:jc w:val="both"/>
         <w:rPr>
           <w:rFonts w:ascii="Times New Roman" w:hAnsi="Times New Roman" w:cs="Times New Roman"/>
-          <w:sz w:val="24"/>
-          <w:szCs w:val="24"/>
-          <w:lang w:val="pt-BR"/>
-        </w:rPr>
-      </w:pPr>
+          <w:b/>
+          <w:bCs/>
+          <w:sz w:val="24"/>
+          <w:szCs w:val="24"/>
+        </w:rPr>
+      </w:pPr>
+    </w:p>
+    <w:p>
+      <w:pPr>
+        <w:rPr>
+          <w:rFonts w:ascii="Times New Roman" w:hAnsi="Times New Roman" w:cs="Times New Roman"/>
+          <w:b/>
+          <w:bCs/>
+          <w:sz w:val="24"/>
+          <w:szCs w:val="24"/>
+        </w:rPr>
+      </w:pPr>
+      <w:r>
+        <w:rPr>
+          <w:rFonts w:ascii="Times New Roman" w:hAnsi="Times New Roman" w:cs="Times New Roman"/>
+          <w:b/>
+          <w:bCs/>
+          <w:sz w:val="24"/>
+          <w:szCs w:val="24"/>
+        </w:rPr>
+        <w:br w:type="page"/>
+      </w:r>
+    </w:p>
+    <w:p>
+      <w:pPr>
+        <w:pStyle w:val="Heading1"/>
+      </w:pPr>
+      <w:r>
+        <w:lastRenderedPageBreak/>
+        <w:t>Descrição geral</w:t>
+      </w:r>
+    </w:p>
+    <w:p>
+      <w:pPr>
+        <w:pStyle w:val="Heading2"/>
+      </w:pPr>
+      <w:r>
+        <w:t>Perspectiva do sistema</w:t>
+      </w:r>
     </w:p>
     <w:p>
       <w:pPr>
@@ -1421,21 +1496,103 @@
         <w:jc w:val="both"/>
         <w:rPr>
           <w:rFonts w:ascii="Times New Roman" w:hAnsi="Times New Roman" w:cs="Times New Roman"/>
-          <w:b/>
-          <w:bCs/>
-          <w:sz w:val="24"/>
-          <w:szCs w:val="24"/>
-        </w:rPr>
-      </w:pPr>
-      <w:r>
-        <w:rPr>
-          <w:rFonts w:ascii="Times New Roman" w:hAnsi="Times New Roman" w:cs="Times New Roman"/>
-          <w:b/>
-          <w:bCs/>
-          <w:sz w:val="24"/>
-          <w:szCs w:val="24"/>
-        </w:rPr>
-        <w:t>Descrição geral</w:t>
+          <w:sz w:val="24"/>
+          <w:szCs w:val="24"/>
+        </w:rPr>
+      </w:pPr>
+      <w:r>
+        <w:rPr>
+          <w:rFonts w:ascii="Times New Roman" w:hAnsi="Times New Roman" w:cs="Times New Roman"/>
+          <w:sz w:val="24"/>
+          <w:szCs w:val="24"/>
+        </w:rPr>
+        <w:t xml:space="preserve">O sistema </w:t>
+      </w:r>
+      <w:r>
+        <w:rPr>
+          <w:rFonts w:ascii="Times New Roman" w:hAnsi="Times New Roman" w:cs="Times New Roman"/>
+          <w:b/>
+          <w:bCs/>
+          <w:sz w:val="24"/>
+          <w:szCs w:val="24"/>
+        </w:rPr>
+        <w:t>JM-InvSM</w:t>
+      </w:r>
+      <w:r>
+        <w:rPr>
+          <w:rFonts w:ascii="Times New Roman" w:hAnsi="Times New Roman" w:cs="Times New Roman"/>
+          <w:sz w:val="24"/>
+          <w:szCs w:val="24"/>
+        </w:rPr>
+        <w:t xml:space="preserve"> (JM-Invoice Stock Master) é uma aplicação de software </w:t>
+      </w:r>
+      <w:r>
+        <w:rPr>
+          <w:rFonts w:ascii="Times New Roman" w:hAnsi="Times New Roman" w:cs="Times New Roman"/>
+          <w:b/>
+          <w:bCs/>
+          <w:sz w:val="24"/>
+          <w:szCs w:val="24"/>
+        </w:rPr>
+        <w:t>desktop</w:t>
+      </w:r>
+      <w:r>
+        <w:rPr>
+          <w:rFonts w:ascii="Times New Roman" w:hAnsi="Times New Roman" w:cs="Times New Roman"/>
+          <w:sz w:val="24"/>
+          <w:szCs w:val="24"/>
+        </w:rPr>
+        <w:t xml:space="preserve"> que representa um novo integrante da família de sistemas </w:t>
+      </w:r>
+      <w:r>
+        <w:rPr>
+          <w:rFonts w:ascii="Times New Roman" w:hAnsi="Times New Roman" w:cs="Times New Roman"/>
+          <w:b/>
+          <w:bCs/>
+          <w:sz w:val="24"/>
+          <w:szCs w:val="24"/>
+        </w:rPr>
+        <w:t>ERP</w:t>
+      </w:r>
+      <w:r>
+        <w:rPr>
+          <w:rFonts w:ascii="Times New Roman" w:hAnsi="Times New Roman" w:cs="Times New Roman"/>
+          <w:sz w:val="24"/>
+          <w:szCs w:val="24"/>
+        </w:rPr>
+        <w:t xml:space="preserve"> (Enterprise Resource Planning) desenvolvido pela JM-Tecnologias. O JM-InvSM é projetado para gerenciar eficientemente </w:t>
+      </w:r>
+      <w:r>
+        <w:rPr>
+          <w:rFonts w:ascii="Times New Roman" w:hAnsi="Times New Roman" w:cs="Times New Roman"/>
+          <w:sz w:val="24"/>
+          <w:szCs w:val="24"/>
+        </w:rPr>
+        <w:t>o</w:t>
+      </w:r>
+      <w:r>
+        <w:rPr>
+          <w:rFonts w:ascii="Times New Roman" w:hAnsi="Times New Roman" w:cs="Times New Roman"/>
+          <w:sz w:val="24"/>
+          <w:szCs w:val="24"/>
+        </w:rPr>
+        <w:t xml:space="preserve"> estoque e processos de </w:t>
+      </w:r>
+      <w:r>
+        <w:rPr>
+          <w:rFonts w:ascii="Times New Roman" w:hAnsi="Times New Roman" w:cs="Times New Roman"/>
+          <w:sz w:val="24"/>
+          <w:szCs w:val="24"/>
+        </w:rPr>
+        <w:t>facturamento</w:t>
+      </w:r>
+      <w:r>
+        <w:rPr>
+          <w:rFonts w:ascii="Times New Roman" w:hAnsi="Times New Roman" w:cs="Times New Roman"/>
+          <w:sz w:val="24"/>
+          <w:szCs w:val="24"/>
+        </w:rPr>
+        <w:t xml:space="preserve"> em ambientes empresariais, proporcionando uma solução integrada e acessível para pequenas e médias empresas.</w:t>
       </w:r>
     </w:p>
     <w:p>
@@ -1444,21 +1601,35 @@
         <w:jc w:val="both"/>
         <w:rPr>
           <w:rFonts w:ascii="Times New Roman" w:hAnsi="Times New Roman" w:cs="Times New Roman"/>
-          <w:b/>
-          <w:bCs/>
-          <w:sz w:val="24"/>
-          <w:szCs w:val="24"/>
-        </w:rPr>
-      </w:pPr>
-      <w:r>
-        <w:rPr>
-          <w:rFonts w:ascii="Times New Roman" w:hAnsi="Times New Roman" w:cs="Times New Roman"/>
-          <w:b/>
-          <w:bCs/>
-          <w:sz w:val="24"/>
-          <w:szCs w:val="24"/>
-        </w:rPr>
-        <w:t>Perspectiva do sistema</w:t>
+          <w:sz w:val="24"/>
+          <w:szCs w:val="24"/>
+        </w:rPr>
+      </w:pPr>
+      <w:r>
+        <w:rPr>
+          <w:rFonts w:ascii="Times New Roman" w:hAnsi="Times New Roman" w:cs="Times New Roman"/>
+          <w:sz w:val="24"/>
+          <w:szCs w:val="24"/>
+        </w:rPr>
+        <w:t xml:space="preserve">A aplicação será acessível a partir de qualquer computador que tenha o executável </w:t>
+      </w:r>
+      <w:r>
+        <w:rPr>
+          <w:rFonts w:ascii="Times New Roman" w:hAnsi="Times New Roman" w:cs="Times New Roman"/>
+          <w:b/>
+          <w:bCs/>
+          <w:sz w:val="24"/>
+          <w:szCs w:val="24"/>
+        </w:rPr>
+        <w:t>.exe</w:t>
+      </w:r>
+      <w:r>
+        <w:rPr>
+          <w:rFonts w:ascii="Times New Roman" w:hAnsi="Times New Roman" w:cs="Times New Roman"/>
+          <w:sz w:val="24"/>
+          <w:szCs w:val="24"/>
+        </w:rPr>
+        <w:t xml:space="preserve"> do sistema instalado. Além disso, o JM-InvSM poderá ser executado em modo portátil, permitindo que os usuários utilizem a aplicação em diferentes máquinas sem a necessidade de instalação prévia.</w:t>
       </w:r>
     </w:p>
     <w:p>
@@ -1477,61 +1648,25 @@
           <w:sz w:val="24"/>
           <w:szCs w:val="24"/>
         </w:rPr>
-        <w:t xml:space="preserve">O sistema </w:t>
-      </w:r>
-      <w:r>
-        <w:rPr>
-          <w:rFonts w:ascii="Times New Roman" w:hAnsi="Times New Roman" w:cs="Times New Roman"/>
-          <w:b/>
-          <w:bCs/>
-          <w:sz w:val="24"/>
-          <w:szCs w:val="24"/>
-        </w:rPr>
-        <w:t>JM-InvSM</w:t>
-      </w:r>
-      <w:r>
-        <w:rPr>
-          <w:rFonts w:ascii="Times New Roman" w:hAnsi="Times New Roman" w:cs="Times New Roman"/>
-          <w:sz w:val="24"/>
-          <w:szCs w:val="24"/>
-        </w:rPr>
-        <w:t xml:space="preserve"> (JM-Invoice Stock Master) é uma aplicação de software </w:t>
-      </w:r>
-      <w:r>
-        <w:rPr>
-          <w:rFonts w:ascii="Times New Roman" w:hAnsi="Times New Roman" w:cs="Times New Roman"/>
-          <w:b/>
-          <w:bCs/>
-          <w:sz w:val="24"/>
-          <w:szCs w:val="24"/>
-        </w:rPr>
-        <w:t>desktop</w:t>
-      </w:r>
-      <w:r>
-        <w:rPr>
-          <w:rFonts w:ascii="Times New Roman" w:hAnsi="Times New Roman" w:cs="Times New Roman"/>
-          <w:sz w:val="24"/>
-          <w:szCs w:val="24"/>
-        </w:rPr>
-        <w:t xml:space="preserve"> que representa um novo integrante da família de sistemas </w:t>
-      </w:r>
-      <w:r>
-        <w:rPr>
-          <w:rFonts w:ascii="Times New Roman" w:hAnsi="Times New Roman" w:cs="Times New Roman"/>
-          <w:b/>
-          <w:bCs/>
-          <w:sz w:val="24"/>
-          <w:szCs w:val="24"/>
-        </w:rPr>
-        <w:t>ERP</w:t>
-      </w:r>
-      <w:r>
-        <w:rPr>
-          <w:rFonts w:ascii="Times New Roman" w:hAnsi="Times New Roman" w:cs="Times New Roman"/>
-          <w:sz w:val="24"/>
-          <w:szCs w:val="24"/>
-        </w:rPr>
-        <w:t xml:space="preserve"> (Enterprise Resource Planning) desenvolvidos pela JM-Tecnologias. O JM-InvSM é projetado para gerenciar eficientemente o controle de estoque e processos de faturamento em ambientes empresariais, proporcionando uma solução integrada e acessível para pequenas e médias empresas.</w:t>
+        <w:t xml:space="preserve">O sistema será composto por um banco de dados </w:t>
+      </w:r>
+      <w:r>
+        <w:rPr>
+          <w:rFonts w:ascii="Times New Roman" w:hAnsi="Times New Roman" w:cs="Times New Roman"/>
+          <w:b/>
+          <w:bCs/>
+          <w:sz w:val="24"/>
+          <w:szCs w:val="24"/>
+        </w:rPr>
+        <w:t>MySQL</w:t>
+      </w:r>
+      <w:r>
+        <w:rPr>
+          <w:rFonts w:ascii="Times New Roman" w:hAnsi="Times New Roman" w:cs="Times New Roman"/>
+          <w:sz w:val="24"/>
+          <w:szCs w:val="24"/>
+        </w:rPr>
+        <w:t>, que poderá ser configurado como local ou remoto, dependendo das necessidades específicas do cliente. Essa flexibilidade permitirá que as empresas escolham a configuração que melhor se adapta ao seu ambiente de trabalho, seja para operações locais ou em uma infraestrutura de nuvem.</w:t>
       </w:r>
     </w:p>
     <w:p>
@@ -1550,25 +1685,130 @@
           <w:sz w:val="24"/>
           <w:szCs w:val="24"/>
         </w:rPr>
-        <w:t xml:space="preserve">A aplicação será acessível a partir de qualquer computador que tenha o executável </w:t>
-      </w:r>
-      <w:r>
-        <w:rPr>
-          <w:rFonts w:ascii="Times New Roman" w:hAnsi="Times New Roman" w:cs="Times New Roman"/>
-          <w:b/>
-          <w:bCs/>
-          <w:sz w:val="24"/>
-          <w:szCs w:val="24"/>
-        </w:rPr>
-        <w:t>.exe</w:t>
-      </w:r>
-      <w:r>
-        <w:rPr>
-          <w:rFonts w:ascii="Times New Roman" w:hAnsi="Times New Roman" w:cs="Times New Roman"/>
-          <w:sz w:val="24"/>
-          <w:szCs w:val="24"/>
-        </w:rPr>
-        <w:t xml:space="preserve"> do sistema instalado. Além disso, o JM-InvSM poderá ser executado em modo portátil, permitindo que os usuários utilizem a aplicação em diferentes máquinas sem a necessidade de instalação prévia.</w:t>
+        <w:t xml:space="preserve">A arquitetura da aplicação é baseada nos padrões </w:t>
+      </w:r>
+      <w:r>
+        <w:rPr>
+          <w:rFonts w:ascii="Times New Roman" w:hAnsi="Times New Roman" w:cs="Times New Roman"/>
+          <w:b/>
+          <w:bCs/>
+          <w:sz w:val="24"/>
+          <w:szCs w:val="24"/>
+        </w:rPr>
+        <w:t>DAO</w:t>
+      </w:r>
+      <w:r>
+        <w:rPr>
+          <w:rFonts w:ascii="Times New Roman" w:hAnsi="Times New Roman" w:cs="Times New Roman"/>
+          <w:sz w:val="24"/>
+          <w:szCs w:val="24"/>
+        </w:rPr>
+        <w:t xml:space="preserve"> (Data Access Object) e </w:t>
+      </w:r>
+      <w:r>
+        <w:rPr>
+          <w:rFonts w:ascii="Times New Roman" w:hAnsi="Times New Roman" w:cs="Times New Roman"/>
+          <w:b/>
+          <w:bCs/>
+          <w:sz w:val="24"/>
+          <w:szCs w:val="24"/>
+        </w:rPr>
+        <w:t>MVC</w:t>
+      </w:r>
+      <w:r>
+        <w:rPr>
+          <w:rFonts w:ascii="Times New Roman" w:hAnsi="Times New Roman" w:cs="Times New Roman"/>
+          <w:sz w:val="24"/>
+          <w:szCs w:val="24"/>
+        </w:rPr>
+        <w:t xml:space="preserve"> (Model-View-Controller), utilizando </w:t>
+      </w:r>
+      <w:r>
+        <w:rPr>
+          <w:rFonts w:ascii="Times New Roman" w:hAnsi="Times New Roman" w:cs="Times New Roman"/>
+          <w:b/>
+          <w:bCs/>
+          <w:sz w:val="24"/>
+          <w:szCs w:val="24"/>
+        </w:rPr>
+        <w:t>JavaFX</w:t>
+      </w:r>
+      <w:r>
+        <w:rPr>
+          <w:rFonts w:ascii="Times New Roman" w:hAnsi="Times New Roman" w:cs="Times New Roman"/>
+          <w:sz w:val="24"/>
+          <w:szCs w:val="24"/>
+        </w:rPr>
+        <w:t xml:space="preserve"> para o desenvolvimento do front-end. Essa abordagem não apenas garante uma separação clara das preocupações, facilitando a manutenção e a escalabilidade do sistema, mas também oferece uma interface de usuário moderna e responsiva.</w:t>
+      </w:r>
+    </w:p>
+    <w:p>
+      <w:pPr>
+        <w:spacing w:line="360" w:lineRule="auto"/>
+        <w:jc w:val="center"/>
+        <w:rPr>
+          <w:rFonts w:ascii="Times New Roman" w:hAnsi="Times New Roman" w:cs="Times New Roman"/>
+          <w:sz w:val="24"/>
+          <w:szCs w:val="24"/>
+        </w:rPr>
+      </w:pPr>
+      <w:r>
+        <w:rPr>
+          <w:rFonts w:ascii="Times New Roman" w:hAnsi="Times New Roman" w:cs="Times New Roman"/>
+          <w:noProof/>
+          <w:sz w:val="24"/>
+          <w:szCs w:val="24"/>
+        </w:rPr>
+        <w:lastRenderedPageBreak/>
+        <w:drawing>
+          <wp:inline distT="0" distB="0" distL="0" distR="0" wp14:anchorId="6815871A" wp14:editId="5970DD65">
+            <wp:extent cx="5400040" cy="3522980"/>
+            <wp:effectExtent l="0" t="0" r="0" b="1270"/>
+            <wp:docPr id="1928682100" name="Picture 7"/>
+            <wp:cNvGraphicFramePr>
+              <a:graphicFrameLocks xmlns:a="http://schemas.openxmlformats.org/drawingml/2006/main" noChangeAspect="1"/>
+            </wp:cNvGraphicFramePr>
+            <a:graphic xmlns:a="http://schemas.openxmlformats.org/drawingml/2006/main">
+              <a:graphicData uri="http://schemas.openxmlformats.org/drawingml/2006/picture">
+                <pic:pic xmlns:pic="http://schemas.openxmlformats.org/drawingml/2006/picture">
+                  <pic:nvPicPr>
+                    <pic:cNvPr id="1928682100" name="Picture 1928682100"/>
+                    <pic:cNvPicPr/>
+                  </pic:nvPicPr>
+                  <pic:blipFill>
+                    <a:blip r:embed="rId7">
+                      <a:extLst>
+                        <a:ext uri="{28A0092B-C50C-407E-A947-70E740481C1C}">
+                          <a14:useLocalDpi xmlns:a14="http://schemas.microsoft.com/office/drawing/2010/main" val="0"/>
+                        </a:ext>
+                      </a:extLst>
+                    </a:blip>
+                    <a:stretch>
+                      <a:fillRect/>
+                    </a:stretch>
+                  </pic:blipFill>
+                  <pic:spPr>
+                    <a:xfrm>
+                      <a:off x="0" y="0"/>
+                      <a:ext cx="5400040" cy="3522980"/>
+                    </a:xfrm>
+                    <a:prstGeom prst="rect">
+                      <a:avLst/>
+                    </a:prstGeom>
+                  </pic:spPr>
+                </pic:pic>
+              </a:graphicData>
+            </a:graphic>
+          </wp:inline>
+        </w:drawing>
+      </w:r>
+    </w:p>
+    <w:p>
+      <w:pPr>
+        <w:pStyle w:val="Heading2"/>
+      </w:pPr>
+      <w:r>
+        <w:t>Funções do sistemas</w:t>
       </w:r>
     </w:p>
     <w:p>
@@ -1587,172 +1827,6 @@
           <w:sz w:val="24"/>
           <w:szCs w:val="24"/>
         </w:rPr>
-        <w:t xml:space="preserve">O sistema será composto por um banco de dados </w:t>
-      </w:r>
-      <w:r>
-        <w:rPr>
-          <w:rFonts w:ascii="Times New Roman" w:hAnsi="Times New Roman" w:cs="Times New Roman"/>
-          <w:b/>
-          <w:bCs/>
-          <w:sz w:val="24"/>
-          <w:szCs w:val="24"/>
-        </w:rPr>
-        <w:t>MySQL</w:t>
-      </w:r>
-      <w:r>
-        <w:rPr>
-          <w:rFonts w:ascii="Times New Roman" w:hAnsi="Times New Roman" w:cs="Times New Roman"/>
-          <w:sz w:val="24"/>
-          <w:szCs w:val="24"/>
-        </w:rPr>
-        <w:t>, que poderá ser configurado como local ou remoto, dependendo das necessidades específicas do cliente. Essa flexibilidade permitirá que as empresas escolham a configuração que melhor se adapta ao seu ambiente de trabalho, seja para operações locais ou em uma infraestrutura de nuvem.</w:t>
-      </w:r>
-    </w:p>
-    <w:p>
-      <w:pPr>
-        <w:spacing w:line="360" w:lineRule="auto"/>
-        <w:jc w:val="both"/>
-        <w:rPr>
-          <w:rFonts w:ascii="Times New Roman" w:hAnsi="Times New Roman" w:cs="Times New Roman"/>
-          <w:sz w:val="24"/>
-          <w:szCs w:val="24"/>
-        </w:rPr>
-      </w:pPr>
-      <w:r>
-        <w:rPr>
-          <w:rFonts w:ascii="Times New Roman" w:hAnsi="Times New Roman" w:cs="Times New Roman"/>
-          <w:sz w:val="24"/>
-          <w:szCs w:val="24"/>
-        </w:rPr>
-        <w:lastRenderedPageBreak/>
-        <w:t xml:space="preserve">A arquitetura da aplicação é baseada nos padrões </w:t>
-      </w:r>
-      <w:r>
-        <w:rPr>
-          <w:rFonts w:ascii="Times New Roman" w:hAnsi="Times New Roman" w:cs="Times New Roman"/>
-          <w:b/>
-          <w:bCs/>
-          <w:sz w:val="24"/>
-          <w:szCs w:val="24"/>
-        </w:rPr>
-        <w:t>DAO</w:t>
-      </w:r>
-      <w:r>
-        <w:rPr>
-          <w:rFonts w:ascii="Times New Roman" w:hAnsi="Times New Roman" w:cs="Times New Roman"/>
-          <w:sz w:val="24"/>
-          <w:szCs w:val="24"/>
-        </w:rPr>
-        <w:t xml:space="preserve"> (Data Access Object) e </w:t>
-      </w:r>
-      <w:r>
-        <w:rPr>
-          <w:rFonts w:ascii="Times New Roman" w:hAnsi="Times New Roman" w:cs="Times New Roman"/>
-          <w:b/>
-          <w:bCs/>
-          <w:sz w:val="24"/>
-          <w:szCs w:val="24"/>
-        </w:rPr>
-        <w:t>MVC</w:t>
-      </w:r>
-      <w:r>
-        <w:rPr>
-          <w:rFonts w:ascii="Times New Roman" w:hAnsi="Times New Roman" w:cs="Times New Roman"/>
-          <w:sz w:val="24"/>
-          <w:szCs w:val="24"/>
-        </w:rPr>
-        <w:t xml:space="preserve"> (Model-View-Controller), utilizando </w:t>
-      </w:r>
-      <w:r>
-        <w:rPr>
-          <w:rFonts w:ascii="Times New Roman" w:hAnsi="Times New Roman" w:cs="Times New Roman"/>
-          <w:b/>
-          <w:bCs/>
-          <w:sz w:val="24"/>
-          <w:szCs w:val="24"/>
-        </w:rPr>
-        <w:t>JavaFX</w:t>
-      </w:r>
-      <w:r>
-        <w:rPr>
-          <w:rFonts w:ascii="Times New Roman" w:hAnsi="Times New Roman" w:cs="Times New Roman"/>
-          <w:sz w:val="24"/>
-          <w:szCs w:val="24"/>
-        </w:rPr>
-        <w:t xml:space="preserve"> para o desenvolvimento do front-end. Essa abordagem não apenas garante uma separação clara das preocupações, facilitando a manutenção e a escalabilidade do sistema, mas também oferece uma interface de usuário moderna e responsiva.</w:t>
-      </w:r>
-    </w:p>
-    <w:p>
-      <w:pPr>
-        <w:spacing w:line="360" w:lineRule="auto"/>
-        <w:jc w:val="both"/>
-        <w:rPr>
-          <w:rFonts w:ascii="Times New Roman" w:hAnsi="Times New Roman" w:cs="Times New Roman"/>
-          <w:sz w:val="24"/>
-          <w:szCs w:val="24"/>
-        </w:rPr>
-      </w:pPr>
-      <w:r>
-        <w:rPr>
-          <w:rFonts w:ascii="Times New Roman" w:hAnsi="Times New Roman" w:cs="Times New Roman"/>
-          <w:sz w:val="24"/>
-          <w:szCs w:val="24"/>
-        </w:rPr>
-        <w:t>Fig. Diagrama de arquitetura</w:t>
-      </w:r>
-    </w:p>
-    <w:p>
-      <w:pPr>
-        <w:spacing w:line="360" w:lineRule="auto"/>
-        <w:jc w:val="both"/>
-        <w:rPr>
-          <w:rFonts w:ascii="Times New Roman" w:hAnsi="Times New Roman" w:cs="Times New Roman"/>
-          <w:sz w:val="24"/>
-          <w:szCs w:val="24"/>
-        </w:rPr>
-      </w:pPr>
-    </w:p>
-    <w:p>
-      <w:pPr>
-        <w:spacing w:line="360" w:lineRule="auto"/>
-        <w:jc w:val="both"/>
-        <w:rPr>
-          <w:rFonts w:ascii="Times New Roman" w:hAnsi="Times New Roman" w:cs="Times New Roman"/>
-          <w:b/>
-          <w:bCs/>
-          <w:sz w:val="24"/>
-          <w:szCs w:val="24"/>
-        </w:rPr>
-      </w:pPr>
-      <w:r>
-        <w:rPr>
-          <w:rFonts w:ascii="Times New Roman" w:hAnsi="Times New Roman" w:cs="Times New Roman"/>
-          <w:b/>
-          <w:bCs/>
-          <w:sz w:val="24"/>
-          <w:szCs w:val="24"/>
-        </w:rPr>
-        <w:t>Funções do sistemas</w:t>
-      </w:r>
-    </w:p>
-    <w:p>
-      <w:pPr>
-        <w:spacing w:line="360" w:lineRule="auto"/>
-        <w:jc w:val="both"/>
-        <w:rPr>
-          <w:rFonts w:ascii="Times New Roman" w:hAnsi="Times New Roman" w:cs="Times New Roman"/>
-          <w:sz w:val="24"/>
-          <w:szCs w:val="24"/>
-          <w:lang w:val="pt-BR"/>
-        </w:rPr>
-      </w:pPr>
-      <w:r>
-        <w:rPr>
-          <w:rFonts w:ascii="Times New Roman" w:hAnsi="Times New Roman" w:cs="Times New Roman"/>
-          <w:sz w:val="24"/>
-          <w:szCs w:val="24"/>
-          <w:lang w:val="pt-BR"/>
-        </w:rPr>
         <w:t xml:space="preserve">O sistema </w:t>
       </w:r>
       <w:r>
@@ -1762,7 +1836,6 @@
           <w:bCs/>
           <w:sz w:val="24"/>
           <w:szCs w:val="24"/>
-          <w:lang w:val="pt-BR"/>
         </w:rPr>
         <w:t>JM-InvSM</w:t>
       </w:r>
@@ -1771,7 +1844,6 @@
           <w:rFonts w:ascii="Times New Roman" w:hAnsi="Times New Roman" w:cs="Times New Roman"/>
           <w:sz w:val="24"/>
           <w:szCs w:val="24"/>
-          <w:lang w:val="pt-BR"/>
         </w:rPr>
         <w:t xml:space="preserve"> deve permitir que os usuários realizem as seguintes funções principais:</w:t>
       </w:r>
@@ -1789,17 +1861,15 @@
           <w:rFonts w:ascii="Times New Roman" w:hAnsi="Times New Roman" w:cs="Times New Roman"/>
           <w:sz w:val="24"/>
           <w:szCs w:val="24"/>
-          <w:lang w:val="pt-BR"/>
-        </w:rPr>
-      </w:pPr>
-      <w:r>
-        <w:rPr>
-          <w:rFonts w:ascii="Times New Roman" w:hAnsi="Times New Roman" w:cs="Times New Roman"/>
-          <w:b/>
-          <w:bCs/>
-          <w:sz w:val="24"/>
-          <w:szCs w:val="24"/>
-          <w:lang w:val="pt-BR"/>
+        </w:rPr>
+      </w:pPr>
+      <w:r>
+        <w:rPr>
+          <w:rFonts w:ascii="Times New Roman" w:hAnsi="Times New Roman" w:cs="Times New Roman"/>
+          <w:b/>
+          <w:bCs/>
+          <w:sz w:val="24"/>
+          <w:szCs w:val="24"/>
         </w:rPr>
         <w:t>Gestão de Usuários</w:t>
       </w:r>
@@ -1808,7 +1878,6 @@
           <w:rFonts w:ascii="Times New Roman" w:hAnsi="Times New Roman" w:cs="Times New Roman"/>
           <w:sz w:val="24"/>
           <w:szCs w:val="24"/>
-          <w:lang w:val="pt-BR"/>
         </w:rPr>
         <w:t>: Cadastro, edição e remoção de usuários com diferentes níveis de acesso e permissões.</w:t>
       </w:r>
@@ -1826,17 +1895,15 @@
           <w:rFonts w:ascii="Times New Roman" w:hAnsi="Times New Roman" w:cs="Times New Roman"/>
           <w:sz w:val="24"/>
           <w:szCs w:val="24"/>
-          <w:lang w:val="pt-BR"/>
-        </w:rPr>
-      </w:pPr>
-      <w:r>
-        <w:rPr>
-          <w:rFonts w:ascii="Times New Roman" w:hAnsi="Times New Roman" w:cs="Times New Roman"/>
-          <w:b/>
-          <w:bCs/>
-          <w:sz w:val="24"/>
-          <w:szCs w:val="24"/>
-          <w:lang w:val="pt-BR"/>
+        </w:rPr>
+      </w:pPr>
+      <w:r>
+        <w:rPr>
+          <w:rFonts w:ascii="Times New Roman" w:hAnsi="Times New Roman" w:cs="Times New Roman"/>
+          <w:b/>
+          <w:bCs/>
+          <w:sz w:val="24"/>
+          <w:szCs w:val="24"/>
         </w:rPr>
         <w:t>Gestão de Clientes</w:t>
       </w:r>
@@ -1845,7 +1912,6 @@
           <w:rFonts w:ascii="Times New Roman" w:hAnsi="Times New Roman" w:cs="Times New Roman"/>
           <w:sz w:val="24"/>
           <w:szCs w:val="24"/>
-          <w:lang w:val="pt-BR"/>
         </w:rPr>
         <w:t>: Criação, edição e exclusão de registos de clientes, permitindo o acompanhamento de informações relevantes.</w:t>
       </w:r>
@@ -1863,17 +1929,15 @@
           <w:rFonts w:ascii="Times New Roman" w:hAnsi="Times New Roman" w:cs="Times New Roman"/>
           <w:sz w:val="24"/>
           <w:szCs w:val="24"/>
-          <w:lang w:val="pt-BR"/>
-        </w:rPr>
-      </w:pPr>
-      <w:r>
-        <w:rPr>
-          <w:rFonts w:ascii="Times New Roman" w:hAnsi="Times New Roman" w:cs="Times New Roman"/>
-          <w:b/>
-          <w:bCs/>
-          <w:sz w:val="24"/>
-          <w:szCs w:val="24"/>
-          <w:lang w:val="pt-BR"/>
+        </w:rPr>
+      </w:pPr>
+      <w:r>
+        <w:rPr>
+          <w:rFonts w:ascii="Times New Roman" w:hAnsi="Times New Roman" w:cs="Times New Roman"/>
+          <w:b/>
+          <w:bCs/>
+          <w:sz w:val="24"/>
+          <w:szCs w:val="24"/>
         </w:rPr>
         <w:t>Gestão de Fornecedores</w:t>
       </w:r>
@@ -1882,9 +1946,24 @@
           <w:rFonts w:ascii="Times New Roman" w:hAnsi="Times New Roman" w:cs="Times New Roman"/>
           <w:sz w:val="24"/>
           <w:szCs w:val="24"/>
-          <w:lang w:val="pt-BR"/>
-        </w:rPr>
-        <w:t>: Cadastro e gerenciamento de fornecedores, incluindo informações de contato e condições de fornecimento.</w:t>
+        </w:rPr>
+        <w:t xml:space="preserve">: Cadastro e gerenciamento de fornecedores, incluindo informações de contato e </w:t>
+      </w:r>
+      <w:r>
+        <w:rPr>
+          <w:rFonts w:ascii="Times New Roman" w:hAnsi="Times New Roman" w:cs="Times New Roman"/>
+          <w:sz w:val="24"/>
+          <w:szCs w:val="24"/>
+        </w:rPr>
+        <w:t>localização</w:t>
+      </w:r>
+      <w:r>
+        <w:rPr>
+          <w:rFonts w:ascii="Times New Roman" w:hAnsi="Times New Roman" w:cs="Times New Roman"/>
+          <w:sz w:val="24"/>
+          <w:szCs w:val="24"/>
+        </w:rPr>
+        <w:t>.</w:t>
       </w:r>
     </w:p>
     <w:p>
@@ -1900,17 +1979,15 @@
           <w:rFonts w:ascii="Times New Roman" w:hAnsi="Times New Roman" w:cs="Times New Roman"/>
           <w:sz w:val="24"/>
           <w:szCs w:val="24"/>
-          <w:lang w:val="pt-BR"/>
-        </w:rPr>
-      </w:pPr>
-      <w:r>
-        <w:rPr>
-          <w:rFonts w:ascii="Times New Roman" w:hAnsi="Times New Roman" w:cs="Times New Roman"/>
-          <w:b/>
-          <w:bCs/>
-          <w:sz w:val="24"/>
-          <w:szCs w:val="24"/>
-          <w:lang w:val="pt-BR"/>
+        </w:rPr>
+      </w:pPr>
+      <w:r>
+        <w:rPr>
+          <w:rFonts w:ascii="Times New Roman" w:hAnsi="Times New Roman" w:cs="Times New Roman"/>
+          <w:b/>
+          <w:bCs/>
+          <w:sz w:val="24"/>
+          <w:szCs w:val="24"/>
         </w:rPr>
         <w:t>Criação de Produtos e Serviços</w:t>
       </w:r>
@@ -1919,7 +1996,6 @@
           <w:rFonts w:ascii="Times New Roman" w:hAnsi="Times New Roman" w:cs="Times New Roman"/>
           <w:sz w:val="24"/>
           <w:szCs w:val="24"/>
-          <w:lang w:val="pt-BR"/>
         </w:rPr>
         <w:t>: Registo e gerenciamento de produtos e serviços oferecidos pela empresa, incluindo detalhes como descrição, preço e categoria.</w:t>
       </w:r>
@@ -1937,17 +2013,15 @@
           <w:rFonts w:ascii="Times New Roman" w:hAnsi="Times New Roman" w:cs="Times New Roman"/>
           <w:sz w:val="24"/>
           <w:szCs w:val="24"/>
-          <w:lang w:val="pt-BR"/>
-        </w:rPr>
-      </w:pPr>
-      <w:r>
-        <w:rPr>
-          <w:rFonts w:ascii="Times New Roman" w:hAnsi="Times New Roman" w:cs="Times New Roman"/>
-          <w:b/>
-          <w:bCs/>
-          <w:sz w:val="24"/>
-          <w:szCs w:val="24"/>
-          <w:lang w:val="pt-BR"/>
+        </w:rPr>
+      </w:pPr>
+      <w:r>
+        <w:rPr>
+          <w:rFonts w:ascii="Times New Roman" w:hAnsi="Times New Roman" w:cs="Times New Roman"/>
+          <w:b/>
+          <w:bCs/>
+          <w:sz w:val="24"/>
+          <w:szCs w:val="24"/>
         </w:rPr>
         <w:t>Associação de Produtos a Fornecedores e Gestão de Estoque</w:t>
       </w:r>
@@ -1956,7 +2030,6 @@
           <w:rFonts w:ascii="Times New Roman" w:hAnsi="Times New Roman" w:cs="Times New Roman"/>
           <w:sz w:val="24"/>
           <w:szCs w:val="24"/>
-          <w:lang w:val="pt-BR"/>
         </w:rPr>
         <w:t>: Vinculação de produtos a fornecedores específicos, juntamente com o controle do nível de estoque e movimentações.</w:t>
       </w:r>
@@ -1974,17 +2047,15 @@
           <w:rFonts w:ascii="Times New Roman" w:hAnsi="Times New Roman" w:cs="Times New Roman"/>
           <w:sz w:val="24"/>
           <w:szCs w:val="24"/>
-          <w:lang w:val="pt-BR"/>
-        </w:rPr>
-      </w:pPr>
-      <w:r>
-        <w:rPr>
-          <w:rFonts w:ascii="Times New Roman" w:hAnsi="Times New Roman" w:cs="Times New Roman"/>
-          <w:b/>
-          <w:bCs/>
-          <w:sz w:val="24"/>
-          <w:szCs w:val="24"/>
-          <w:lang w:val="pt-BR"/>
+        </w:rPr>
+      </w:pPr>
+      <w:r>
+        <w:rPr>
+          <w:rFonts w:ascii="Times New Roman" w:hAnsi="Times New Roman" w:cs="Times New Roman"/>
+          <w:b/>
+          <w:bCs/>
+          <w:sz w:val="24"/>
+          <w:szCs w:val="24"/>
         </w:rPr>
         <w:t>Emissão de Faturas e Relatórios</w:t>
       </w:r>
@@ -1993,7 +2064,6 @@
           <w:rFonts w:ascii="Times New Roman" w:hAnsi="Times New Roman" w:cs="Times New Roman"/>
           <w:sz w:val="24"/>
           <w:szCs w:val="24"/>
-          <w:lang w:val="pt-BR"/>
         </w:rPr>
         <w:t>: Geração de faturas para clientes e relatórios detalhados sobre todas as entidades do sistema, permitindo uma análise completa do desempenho e das operações.</w:t>
       </w:r>
@@ -2012,74 +2082,66 @@
       <w:r>
         <w:rPr>
           <w:rFonts w:ascii="Times New Roman" w:hAnsi="Times New Roman" w:cs="Times New Roman"/>
+          <w:noProof/>
           <w:sz w:val="24"/>
           <w:szCs w:val="24"/>
           <w:lang w:val="pt-BR"/>
         </w:rPr>
-        <w:t>Fig. Diagrama de fluxo</w:t>
-      </w:r>
-    </w:p>
-    <w:p>
-      <w:pPr>
-        <w:spacing w:line="360" w:lineRule="auto"/>
-        <w:jc w:val="both"/>
-        <w:rPr>
-          <w:rFonts w:ascii="Times New Roman" w:hAnsi="Times New Roman" w:cs="Times New Roman"/>
-          <w:b/>
-          <w:bCs/>
-          <w:sz w:val="24"/>
-          <w:szCs w:val="24"/>
+        <w:lastRenderedPageBreak/>
+        <w:drawing>
+          <wp:inline distT="0" distB="0" distL="0" distR="0" wp14:anchorId="710F0328" wp14:editId="67F8F9A2">
+            <wp:extent cx="5400040" cy="3477260"/>
+            <wp:effectExtent l="0" t="0" r="0" b="0"/>
+            <wp:docPr id="2023573595" name="Picture 2"/>
+            <wp:cNvGraphicFramePr>
+              <a:graphicFrameLocks xmlns:a="http://schemas.openxmlformats.org/drawingml/2006/main" noChangeAspect="1"/>
+            </wp:cNvGraphicFramePr>
+            <a:graphic xmlns:a="http://schemas.openxmlformats.org/drawingml/2006/main">
+              <a:graphicData uri="http://schemas.openxmlformats.org/drawingml/2006/picture">
+                <pic:pic xmlns:pic="http://schemas.openxmlformats.org/drawingml/2006/picture">
+                  <pic:nvPicPr>
+                    <pic:cNvPr id="2023573595" name="Picture 2023573595"/>
+                    <pic:cNvPicPr/>
+                  </pic:nvPicPr>
+                  <pic:blipFill>
+                    <a:blip r:embed="rId8" cstate="print">
+                      <a:extLst>
+                        <a:ext uri="{28A0092B-C50C-407E-A947-70E740481C1C}">
+                          <a14:useLocalDpi xmlns:a14="http://schemas.microsoft.com/office/drawing/2010/main" val="0"/>
+                        </a:ext>
+                      </a:extLst>
+                    </a:blip>
+                    <a:stretch>
+                      <a:fillRect/>
+                    </a:stretch>
+                  </pic:blipFill>
+                  <pic:spPr>
+                    <a:xfrm>
+                      <a:off x="0" y="0"/>
+                      <a:ext cx="5400040" cy="3477260"/>
+                    </a:xfrm>
+                    <a:prstGeom prst="rect">
+                      <a:avLst/>
+                    </a:prstGeom>
+                  </pic:spPr>
+                </pic:pic>
+              </a:graphicData>
+            </a:graphic>
+          </wp:inline>
+        </w:drawing>
+      </w:r>
+    </w:p>
+    <w:p>
+      <w:pPr>
+        <w:pStyle w:val="Heading2"/>
+        <w:rPr>
           <w:lang w:val="pt-BR"/>
         </w:rPr>
       </w:pPr>
-    </w:p>
-    <w:p>
-      <w:pPr>
-        <w:spacing w:line="360" w:lineRule="auto"/>
-        <w:rPr>
-          <w:rFonts w:ascii="Times New Roman" w:hAnsi="Times New Roman" w:cs="Times New Roman"/>
-          <w:b/>
-          <w:bCs/>
-          <w:sz w:val="24"/>
-          <w:szCs w:val="24"/>
+      <w:r>
+        <w:rPr>
           <w:lang w:val="pt-BR"/>
         </w:rPr>
-      </w:pPr>
-      <w:r>
-        <w:rPr>
-          <w:rFonts w:ascii="Times New Roman" w:hAnsi="Times New Roman" w:cs="Times New Roman"/>
-          <w:b/>
-          <w:bCs/>
-          <w:sz w:val="24"/>
-          <w:szCs w:val="24"/>
-          <w:lang w:val="pt-BR"/>
-        </w:rPr>
-        <w:br w:type="page"/>
-      </w:r>
-    </w:p>
-    <w:p>
-      <w:pPr>
-        <w:spacing w:line="360" w:lineRule="auto"/>
-        <w:jc w:val="both"/>
-        <w:rPr>
-          <w:rFonts w:ascii="Times New Roman" w:hAnsi="Times New Roman" w:cs="Times New Roman"/>
-          <w:b/>
-          <w:bCs/>
-          <w:sz w:val="24"/>
-          <w:szCs w:val="24"/>
-          <w:lang w:val="pt-BR"/>
-        </w:rPr>
-      </w:pPr>
-      <w:r>
-        <w:rPr>
-          <w:rFonts w:ascii="Times New Roman" w:hAnsi="Times New Roman" w:cs="Times New Roman"/>
-          <w:b/>
-          <w:bCs/>
-          <w:sz w:val="24"/>
-          <w:szCs w:val="24"/>
-          <w:lang w:val="pt-BR"/>
-        </w:rPr>
-        <w:lastRenderedPageBreak/>
         <w:t>Classe de usuarios e caracteristicas</w:t>
       </w:r>
     </w:p>
@@ -2531,6 +2593,7 @@
           <w:sz w:val="24"/>
           <w:szCs w:val="24"/>
         </w:rPr>
+        <w:lastRenderedPageBreak/>
         <w:t>Características</w:t>
       </w:r>
       <w:r>
@@ -2801,7 +2864,6 @@
           <w:sz w:val="24"/>
           <w:szCs w:val="24"/>
         </w:rPr>
-        <w:lastRenderedPageBreak/>
         <w:t>Focados na manutenção e supervisão do estoque.</w:t>
       </w:r>
     </w:p>
@@ -3100,23 +3162,73 @@
     <w:p>
       <w:pPr>
         <w:spacing w:line="360" w:lineRule="auto"/>
-        <w:jc w:val="both"/>
-        <w:rPr>
-          <w:rFonts w:ascii="Times New Roman" w:hAnsi="Times New Roman" w:cs="Times New Roman"/>
-          <w:b/>
-          <w:bCs/>
-          <w:sz w:val="24"/>
-          <w:szCs w:val="24"/>
-        </w:rPr>
-      </w:pPr>
-      <w:r>
-        <w:rPr>
-          <w:rFonts w:ascii="Times New Roman" w:hAnsi="Times New Roman" w:cs="Times New Roman"/>
-          <w:b/>
-          <w:bCs/>
-          <w:sz w:val="24"/>
-          <w:szCs w:val="24"/>
-        </w:rPr>
+        <w:jc w:val="center"/>
+        <w:rPr>
+          <w:rFonts w:ascii="Times New Roman" w:hAnsi="Times New Roman" w:cs="Times New Roman"/>
+          <w:b/>
+          <w:bCs/>
+          <w:sz w:val="24"/>
+          <w:szCs w:val="24"/>
+        </w:rPr>
+      </w:pPr>
+      <w:r>
+        <w:rPr>
+          <w:rFonts w:ascii="Times New Roman" w:hAnsi="Times New Roman" w:cs="Times New Roman"/>
+          <w:b/>
+          <w:bCs/>
+          <w:noProof/>
+          <w:sz w:val="24"/>
+          <w:szCs w:val="24"/>
+        </w:rPr>
+        <w:lastRenderedPageBreak/>
+        <w:drawing>
+          <wp:inline distT="0" distB="0" distL="0" distR="0" wp14:anchorId="558DAF77" wp14:editId="37914C7C">
+            <wp:extent cx="5201728" cy="4476888"/>
+            <wp:effectExtent l="0" t="0" r="0" b="0"/>
+            <wp:docPr id="2143454199" name="Picture 1"/>
+            <wp:cNvGraphicFramePr>
+              <a:graphicFrameLocks xmlns:a="http://schemas.openxmlformats.org/drawingml/2006/main" noChangeAspect="1"/>
+            </wp:cNvGraphicFramePr>
+            <a:graphic xmlns:a="http://schemas.openxmlformats.org/drawingml/2006/main">
+              <a:graphicData uri="http://schemas.openxmlformats.org/drawingml/2006/picture">
+                <pic:pic xmlns:pic="http://schemas.openxmlformats.org/drawingml/2006/picture">
+                  <pic:nvPicPr>
+                    <pic:cNvPr id="2143454199" name="Picture 2143454199"/>
+                    <pic:cNvPicPr/>
+                  </pic:nvPicPr>
+                  <pic:blipFill>
+                    <a:blip r:embed="rId9" cstate="print">
+                      <a:extLst>
+                        <a:ext uri="{28A0092B-C50C-407E-A947-70E740481C1C}">
+                          <a14:useLocalDpi xmlns:a14="http://schemas.microsoft.com/office/drawing/2010/main" val="0"/>
+                        </a:ext>
+                      </a:extLst>
+                    </a:blip>
+                    <a:stretch>
+                      <a:fillRect/>
+                    </a:stretch>
+                  </pic:blipFill>
+                  <pic:spPr>
+                    <a:xfrm>
+                      <a:off x="0" y="0"/>
+                      <a:ext cx="5216730" cy="4489800"/>
+                    </a:xfrm>
+                    <a:prstGeom prst="rect">
+                      <a:avLst/>
+                    </a:prstGeom>
+                  </pic:spPr>
+                </pic:pic>
+              </a:graphicData>
+            </a:graphic>
+          </wp:inline>
+        </w:drawing>
+      </w:r>
+    </w:p>
+    <w:p>
+      <w:pPr>
+        <w:pStyle w:val="Heading2"/>
+      </w:pPr>
+      <w:r>
         <w:t>Importância das Classes de Usuários</w:t>
       </w:r>
     </w:p>
@@ -3266,22 +3378,40 @@
         <w:jc w:val="both"/>
         <w:rPr>
           <w:rFonts w:ascii="Times New Roman" w:hAnsi="Times New Roman" w:cs="Times New Roman"/>
-          <w:b/>
-          <w:bCs/>
-          <w:sz w:val="24"/>
-          <w:szCs w:val="24"/>
+          <w:sz w:val="24"/>
+          <w:szCs w:val="24"/>
+        </w:rPr>
+      </w:pPr>
+    </w:p>
+    <w:p>
+      <w:pPr>
+        <w:rPr>
+          <w:rFonts w:ascii="Times New Roman" w:hAnsi="Times New Roman" w:cs="Times New Roman"/>
+          <w:sz w:val="24"/>
+          <w:szCs w:val="24"/>
+        </w:rPr>
+      </w:pPr>
+      <w:r>
+        <w:rPr>
+          <w:rFonts w:ascii="Times New Roman" w:hAnsi="Times New Roman" w:cs="Times New Roman"/>
+          <w:sz w:val="24"/>
+          <w:szCs w:val="24"/>
+        </w:rPr>
+        <w:br w:type="page"/>
+      </w:r>
+    </w:p>
+    <w:p>
+      <w:pPr>
+        <w:pStyle w:val="Heading2"/>
+        <w:rPr>
           <w:lang w:val="pt-BR"/>
         </w:rPr>
       </w:pPr>
       <w:r>
         <w:rPr>
-          <w:rFonts w:ascii="Times New Roman" w:hAnsi="Times New Roman" w:cs="Times New Roman"/>
-          <w:b/>
-          <w:bCs/>
-          <w:sz w:val="24"/>
-          <w:szCs w:val="24"/>
           <w:lang w:val="pt-BR"/>
         </w:rPr>
+        <w:lastRenderedPageBreak/>
         <w:t>Ambiente operacional</w:t>
       </w:r>
     </w:p>
@@ -3531,7 +3661,6 @@
           <w:sz w:val="24"/>
           <w:szCs w:val="24"/>
         </w:rPr>
-        <w:lastRenderedPageBreak/>
         <w:t xml:space="preserve">Windows </w:t>
       </w:r>
       <w:r>
@@ -3600,17 +3729,7 @@
           <w:sz w:val="24"/>
           <w:szCs w:val="24"/>
         </w:rPr>
-        <w:t xml:space="preserve">Componentes de </w:t>
-      </w:r>
-      <w:r>
-        <w:rPr>
-          <w:rFonts w:ascii="Times New Roman" w:hAnsi="Times New Roman" w:cs="Times New Roman"/>
-          <w:b/>
-          <w:bCs/>
-          <w:sz w:val="24"/>
-          <w:szCs w:val="24"/>
-        </w:rPr>
-        <w:t>Software</w:t>
+        <w:t>Componentes de Software</w:t>
       </w:r>
     </w:p>
     <w:p>
@@ -3883,41 +4002,70 @@
     </w:p>
     <w:p>
       <w:pPr>
+        <w:rPr>
+          <w:rFonts w:ascii="Times New Roman" w:hAnsi="Times New Roman" w:cs="Times New Roman"/>
+          <w:sz w:val="24"/>
+          <w:szCs w:val="24"/>
+          <w:lang w:val="pt-BR"/>
+        </w:rPr>
+      </w:pPr>
+      <w:r>
+        <w:rPr>
+          <w:rFonts w:ascii="Times New Roman" w:hAnsi="Times New Roman" w:cs="Times New Roman"/>
+          <w:noProof/>
+          <w:sz w:val="24"/>
+          <w:szCs w:val="24"/>
+        </w:rPr>
+        <w:lastRenderedPageBreak/>
+        <w:drawing>
+          <wp:inline distT="0" distB="0" distL="0" distR="0" wp14:anchorId="5C300C3C" wp14:editId="3A5235CF">
+            <wp:extent cx="5400040" cy="2771140"/>
+            <wp:effectExtent l="0" t="0" r="0" b="0"/>
+            <wp:docPr id="2028995690" name="Picture 4"/>
+            <wp:cNvGraphicFramePr>
+              <a:graphicFrameLocks xmlns:a="http://schemas.openxmlformats.org/drawingml/2006/main" noChangeAspect="1"/>
+            </wp:cNvGraphicFramePr>
+            <a:graphic xmlns:a="http://schemas.openxmlformats.org/drawingml/2006/main">
+              <a:graphicData uri="http://schemas.openxmlformats.org/drawingml/2006/picture">
+                <pic:pic xmlns:pic="http://schemas.openxmlformats.org/drawingml/2006/picture">
+                  <pic:nvPicPr>
+                    <pic:cNvPr id="2028995690" name="Picture 2028995690"/>
+                    <pic:cNvPicPr/>
+                  </pic:nvPicPr>
+                  <pic:blipFill>
+                    <a:blip r:embed="rId10" cstate="print">
+                      <a:extLst>
+                        <a:ext uri="{28A0092B-C50C-407E-A947-70E740481C1C}">
+                          <a14:useLocalDpi xmlns:a14="http://schemas.microsoft.com/office/drawing/2010/main" val="0"/>
+                        </a:ext>
+                      </a:extLst>
+                    </a:blip>
+                    <a:stretch>
+                      <a:fillRect/>
+                    </a:stretch>
+                  </pic:blipFill>
+                  <pic:spPr>
+                    <a:xfrm>
+                      <a:off x="0" y="0"/>
+                      <a:ext cx="5400040" cy="2771140"/>
+                    </a:xfrm>
+                    <a:prstGeom prst="rect">
+                      <a:avLst/>
+                    </a:prstGeom>
+                  </pic:spPr>
+                </pic:pic>
+              </a:graphicData>
+            </a:graphic>
+          </wp:inline>
+        </w:drawing>
+      </w:r>
+    </w:p>
+    <w:p>
+      <w:pPr>
         <w:spacing w:line="360" w:lineRule="auto"/>
         <w:jc w:val="both"/>
         <w:rPr>
           <w:rFonts w:ascii="Times New Roman" w:hAnsi="Times New Roman" w:cs="Times New Roman"/>
-          <w:sz w:val="24"/>
-          <w:szCs w:val="24"/>
-          <w:lang w:val="pt-BR"/>
-        </w:rPr>
-      </w:pPr>
-    </w:p>
-    <w:p>
-      <w:pPr>
-        <w:rPr>
-          <w:rFonts w:ascii="Times New Roman" w:hAnsi="Times New Roman" w:cs="Times New Roman"/>
-          <w:sz w:val="24"/>
-          <w:szCs w:val="24"/>
-          <w:lang w:val="pt-BR"/>
-        </w:rPr>
-      </w:pPr>
-      <w:r>
-        <w:rPr>
-          <w:rFonts w:ascii="Times New Roman" w:hAnsi="Times New Roman" w:cs="Times New Roman"/>
-          <w:sz w:val="24"/>
-          <w:szCs w:val="24"/>
-          <w:lang w:val="pt-BR"/>
-        </w:rPr>
-        <w:br w:type="page"/>
-      </w:r>
-    </w:p>
-    <w:p>
-      <w:pPr>
-        <w:spacing w:line="360" w:lineRule="auto"/>
-        <w:jc w:val="both"/>
-        <w:rPr>
-          <w:rFonts w:ascii="Times New Roman" w:hAnsi="Times New Roman" w:cs="Times New Roman"/>
           <w:b/>
           <w:bCs/>
           <w:i/>
@@ -3936,7 +4084,6 @@
           <w:sz w:val="24"/>
           <w:szCs w:val="24"/>
         </w:rPr>
-        <w:lastRenderedPageBreak/>
         <w:t>Restrições</w:t>
       </w:r>
     </w:p>
@@ -4349,15 +4496,7 @@
           <w:sz w:val="24"/>
           <w:szCs w:val="24"/>
         </w:rPr>
-        <w:t>o sistema deve permitir, de acordo com o nível de acesso, que usuários registem, actualizem e excluam dados</w:t>
-      </w:r>
-      <w:r>
-        <w:rPr>
-          <w:rFonts w:ascii="Times New Roman" w:hAnsi="Times New Roman" w:cs="Times New Roman"/>
-          <w:sz w:val="24"/>
-          <w:szCs w:val="24"/>
-        </w:rPr>
-        <w:t xml:space="preserve"> de:</w:t>
+        <w:t>o sistema deve permitir, de acordo com o nível de acesso, que usuários registem, actualizem e excluam dados de:</w:t>
       </w:r>
     </w:p>
     <w:p>
@@ -4473,7 +4612,7 @@
       </w:r>
     </w:p>
     <w:sectPr>
-      <w:headerReference w:type="default" r:id="rId7"/>
+      <w:headerReference w:type="default" r:id="rId11"/>
       <w:pgSz w:w="11906" w:h="16838"/>
       <w:pgMar w:top="1417" w:right="1701" w:bottom="1417" w:left="1701" w:header="0" w:footer="0" w:gutter="0"/>
       <w:cols w:space="720"/>
@@ -10955,9 +11094,52 @@
     <w:name w:val="Normal"/>
     <w:qFormat/>
   </w:style>
+  <w:style w:type="paragraph" w:styleId="Heading1">
+    <w:name w:val="heading 1"/>
+    <w:basedOn w:val="Normal"/>
+    <w:next w:val="Normal"/>
+    <w:link w:val="Heading1Char"/>
+    <w:uiPriority w:val="9"/>
+    <w:qFormat/>
+    <w:rsid w:val="008E7C02"/>
+    <w:pPr>
+      <w:keepNext/>
+      <w:keepLines/>
+      <w:spacing w:before="120" w:after="120"/>
+      <w:jc w:val="both"/>
+      <w:outlineLvl w:val="0"/>
+    </w:pPr>
+    <w:rPr>
+      <w:rFonts w:ascii="Times New Roman" w:eastAsiaTheme="majorEastAsia" w:hAnsi="Times New Roman" w:cstheme="majorBidi"/>
+      <w:sz w:val="48"/>
+      <w:szCs w:val="32"/>
+    </w:rPr>
+  </w:style>
+  <w:style w:type="paragraph" w:styleId="Heading2">
+    <w:name w:val="heading 2"/>
+    <w:basedOn w:val="Normal"/>
+    <w:next w:val="Normal"/>
+    <w:link w:val="Heading2Char"/>
+    <w:uiPriority w:val="9"/>
+    <w:unhideWhenUsed/>
+    <w:qFormat/>
+    <w:rsid w:val="008E7C02"/>
+    <w:pPr>
+      <w:keepNext/>
+      <w:keepLines/>
+      <w:spacing w:before="120" w:after="120"/>
+      <w:outlineLvl w:val="1"/>
+    </w:pPr>
+    <w:rPr>
+      <w:rFonts w:ascii="Times New Roman" w:eastAsiaTheme="majorEastAsia" w:hAnsi="Times New Roman" w:cstheme="majorBidi"/>
+      <w:sz w:val="32"/>
+      <w:szCs w:val="26"/>
+    </w:rPr>
+  </w:style>
   <w:style w:type="character" w:default="1" w:styleId="DefaultParagraphFont">
     <w:name w:val="Default Paragraph Font"/>
     <w:uiPriority w:val="1"/>
+    <w:semiHidden/>
     <w:unhideWhenUsed/>
   </w:style>
   <w:style w:type="table" w:default="1" w:styleId="TableNormal">
@@ -11100,6 +11282,30 @@
         <w:insideV w:val="single" w:sz="4" w:space="0" w:color="auto"/>
       </w:tblBorders>
     </w:tblPr>
+  </w:style>
+  <w:style w:type="character" w:customStyle="1" w:styleId="Heading1Char">
+    <w:name w:val="Heading 1 Char"/>
+    <w:basedOn w:val="DefaultParagraphFont"/>
+    <w:link w:val="Heading1"/>
+    <w:uiPriority w:val="9"/>
+    <w:rsid w:val="008E7C02"/>
+    <w:rPr>
+      <w:rFonts w:ascii="Times New Roman" w:eastAsiaTheme="majorEastAsia" w:hAnsi="Times New Roman" w:cstheme="majorBidi"/>
+      <w:sz w:val="48"/>
+      <w:szCs w:val="32"/>
+    </w:rPr>
+  </w:style>
+  <w:style w:type="character" w:customStyle="1" w:styleId="Heading2Char">
+    <w:name w:val="Heading 2 Char"/>
+    <w:basedOn w:val="DefaultParagraphFont"/>
+    <w:link w:val="Heading2"/>
+    <w:uiPriority w:val="9"/>
+    <w:rsid w:val="008E7C02"/>
+    <w:rPr>
+      <w:rFonts w:ascii="Times New Roman" w:eastAsiaTheme="majorEastAsia" w:hAnsi="Times New Roman" w:cstheme="majorBidi"/>
+      <w:sz w:val="32"/>
+      <w:szCs w:val="26"/>
+    </w:rPr>
   </w:style>
 </w:styles>
 </file>

</xml_diff>